<commit_message>
feat: add Logistic Regression, Random Forest, Top-K predictions & joblib model cache
- dashboard.py: add 2 new classifiers (LogisticRegression, RandomForestClassifier)
- dashboard.py: predict_topk() - show top-K next chars with probability bars
- dashboard.py: joblib save/load for all 5 models (models/autolingo_models.joblib)
- dashboard.py: Retrain & overwrite cache button in sidebar
- dashboard.py: 5-model cards + 5 completion tabs in Live Autocomplete page
- models/autolingo_models.joblib: pre-trained model cache (no retraining on launch)
- generate_ppt.py: PPT generation script
- AutoLingo_Presentation.pptx / AutoLingo Presentation_final.pptx: slides
- AutoLingo_Internship_Report_Complete.docx: updated internship report
</commit_message>
<xml_diff>
--- a/AutoLingo_Internship_Report_Complete.docx
+++ b/AutoLingo_Internship_Report_Complete.docx
@@ -140,10 +140,10 @@
           <w:noProof/>
         </w:rPr>
         <w:drawing>
-          <wp:inline distT="0" distB="0" distL="0" distR="0" wp14:anchorId="1B9D3731" wp14:editId="66016A95">
-            <wp:extent cx="2355850" cy="2340684"/>
-            <wp:effectExtent l="0" t="0" r="6350" b="2540"/>
-            <wp:docPr id="2135913174" name="Picture 1"/>
+          <wp:inline distT="0" distB="0" distL="0" distR="0" wp14:anchorId="655E6E26" wp14:editId="2D2B70B6">
+            <wp:extent cx="2354400" cy="2083482"/>
+            <wp:effectExtent l="0" t="0" r="8255" b="0"/>
+            <wp:docPr id="1228073957" name="Picture 1"/>
             <wp:cNvGraphicFramePr>
               <a:graphicFrameLocks xmlns:a="http://schemas.openxmlformats.org/drawingml/2006/main" noChangeAspect="1"/>
             </wp:cNvGraphicFramePr>
@@ -151,7 +151,7 @@
               <a:graphicData uri="http://schemas.openxmlformats.org/drawingml/2006/picture">
                 <pic:pic xmlns:pic="http://schemas.openxmlformats.org/drawingml/2006/picture">
                   <pic:nvPicPr>
-                    <pic:cNvPr id="2135913174" name="Picture 2135913174"/>
+                    <pic:cNvPr id="1228073957" name=""/>
                     <pic:cNvPicPr/>
                   </pic:nvPicPr>
                   <pic:blipFill>
@@ -163,7 +163,7 @@
                   <pic:spPr>
                     <a:xfrm>
                       <a:off x="0" y="0"/>
-                      <a:ext cx="2362313" cy="2347105"/>
+                      <a:ext cx="2354400" cy="2083482"/>
                     </a:xfrm>
                     <a:prstGeom prst="rect">
                       <a:avLst/>
@@ -408,10 +408,10 @@
           <w:sz w:val="24"/>
         </w:rPr>
         <w:drawing>
-          <wp:inline distT="0" distB="0" distL="0" distR="0" wp14:anchorId="46DD1CB4" wp14:editId="7083AADB">
-            <wp:extent cx="2355161" cy="2340000"/>
-            <wp:effectExtent l="0" t="0" r="7620" b="3175"/>
-            <wp:docPr id="1837541911" name="Picture 2"/>
+          <wp:inline distT="0" distB="0" distL="0" distR="0" wp14:anchorId="07F8C2DF" wp14:editId="22EDC54C">
+            <wp:extent cx="2354400" cy="2083482"/>
+            <wp:effectExtent l="0" t="0" r="8255" b="0"/>
+            <wp:docPr id="1883745523" name="Picture 1"/>
             <wp:cNvGraphicFramePr>
               <a:graphicFrameLocks xmlns:a="http://schemas.openxmlformats.org/drawingml/2006/main" noChangeAspect="1"/>
             </wp:cNvGraphicFramePr>
@@ -419,7 +419,7 @@
               <a:graphicData uri="http://schemas.openxmlformats.org/drawingml/2006/picture">
                 <pic:pic xmlns:pic="http://schemas.openxmlformats.org/drawingml/2006/picture">
                   <pic:nvPicPr>
-                    <pic:cNvPr id="1837541911" name="Picture 1837541911"/>
+                    <pic:cNvPr id="1883745523" name=""/>
                     <pic:cNvPicPr/>
                   </pic:nvPicPr>
                   <pic:blipFill>
@@ -431,7 +431,7 @@
                   <pic:spPr>
                     <a:xfrm>
                       <a:off x="0" y="0"/>
-                      <a:ext cx="2355161" cy="2340000"/>
+                      <a:ext cx="2354400" cy="2083482"/>
                     </a:xfrm>
                     <a:prstGeom prst="rect">
                       <a:avLst/>
@@ -2740,7 +2740,7 @@
       </w:tr>
       <w:tr>
         <w:trPr>
-          <w:trHeight w:val="1846"/>
+          <w:trHeight w:val="1096"/>
         </w:trPr>
         <w:tc>
           <w:tcPr>
@@ -6358,12 +6358,17 @@
     <w:p>
       <w:pPr>
         <w:spacing w:before="160" w:after="80"/>
+        <w:rPr>
+          <w:sz w:val="24"/>
+          <w:szCs w:val="24"/>
+        </w:rPr>
       </w:pPr>
       <w:r>
         <w:rPr>
           <w:rFonts w:ascii="Times New Roman" w:hAnsi="Times New Roman"/>
           <w:b/>
-          <w:sz w:val="24"/>
+          <w:sz w:val="28"/>
+          <w:szCs w:val="24"/>
         </w:rPr>
         <w:t>7.1 Model Performance (Accuracy &amp; F1 Score per Model)</w:t>
       </w:r>
@@ -6613,12 +6618,17 @@
     <w:p>
       <w:pPr>
         <w:spacing w:before="160" w:after="80"/>
+        <w:rPr>
+          <w:sz w:val="24"/>
+          <w:szCs w:val="24"/>
+        </w:rPr>
       </w:pPr>
       <w:r>
         <w:rPr>
           <w:rFonts w:ascii="Times New Roman" w:hAnsi="Times New Roman"/>
           <w:b/>
-          <w:sz w:val="24"/>
+          <w:sz w:val="28"/>
+          <w:szCs w:val="24"/>
         </w:rPr>
         <w:t>7.2 Visualization of Results (Bar Charts, Regression Forecasting Curves)</w:t>
       </w:r>
@@ -6678,12 +6688,17 @@
     <w:p>
       <w:pPr>
         <w:spacing w:before="160" w:after="80"/>
+        <w:rPr>
+          <w:sz w:val="24"/>
+          <w:szCs w:val="24"/>
+        </w:rPr>
       </w:pPr>
       <w:r>
         <w:rPr>
           <w:rFonts w:ascii="Times New Roman" w:hAnsi="Times New Roman"/>
           <w:b/>
-          <w:sz w:val="24"/>
+          <w:sz w:val="28"/>
+          <w:szCs w:val="24"/>
         </w:rPr>
         <w:t>7.3 Streamlit App Output (Live Autocomplete Demo)</w:t>
       </w:r>
@@ -6810,12 +6825,17 @@
     <w:p>
       <w:pPr>
         <w:spacing w:before="160" w:after="80"/>
+        <w:rPr>
+          <w:sz w:val="24"/>
+          <w:szCs w:val="24"/>
+        </w:rPr>
       </w:pPr>
       <w:r>
         <w:rPr>
           <w:rFonts w:ascii="Times New Roman" w:hAnsi="Times New Roman"/>
           <w:b/>
-          <w:sz w:val="24"/>
+          <w:sz w:val="28"/>
+          <w:szCs w:val="24"/>
         </w:rPr>
         <w:t>7.4 Interpretation of Predictions</w:t>
       </w:r>
@@ -6853,32 +6873,22 @@
           <w:sz w:val="24"/>
         </w:rPr>
         <w:lastRenderedPageBreak/>
-        <w:t>time, while larger configurations show lower validation loss but require significantly more compute. The polynomial regression model captures the non-linear nature of this relationship more accurately than linear regression alone, providing practitioners with better guidance for hyperparameter selection.</w:t>
-      </w:r>
-    </w:p>
-    <w:p>
-      <w:pPr>
-        <w:spacing w:after="120" w:line="360" w:lineRule="exact"/>
-      </w:pPr>
-    </w:p>
-    <w:p>
-      <w:r>
-        <w:rPr>
-          <w:noProof/>
-        </w:rPr>
+        <w:t xml:space="preserve">time, while larger configurations show lower validation loss but require significantly more compute. The polynomial regression model captures the non-linear nature of this relationship more accurately than linear regression alone, providing practitioners with better guidance for </w:t>
+      </w:r>
+      <w:r>
         <w:drawing>
-          <wp:anchor distT="0" distB="0" distL="114300" distR="114300" simplePos="0" relativeHeight="251659776" behindDoc="0" locked="0" layoutInCell="1" allowOverlap="1" wp14:anchorId="14A7840A" wp14:editId="5824D629">
+          <wp:anchor distT="0" distB="0" distL="114300" distR="114300" simplePos="0" relativeHeight="251659776" behindDoc="0" locked="0" layoutInCell="1" allowOverlap="1" wp14:anchorId="792DAB40" wp14:editId="091803F8">
             <wp:simplePos x="0" y="0"/>
             <wp:positionH relativeFrom="column">
-              <wp:posOffset>3175</wp:posOffset>
+              <wp:posOffset>0</wp:posOffset>
             </wp:positionH>
             <wp:positionV relativeFrom="paragraph">
-              <wp:posOffset>1185333</wp:posOffset>
+              <wp:posOffset>1143000</wp:posOffset>
             </wp:positionV>
-            <wp:extent cx="5760720" cy="2731770"/>
+            <wp:extent cx="5760720" cy="2788920"/>
             <wp:effectExtent l="0" t="0" r="0" b="0"/>
             <wp:wrapSquare wrapText="bothSides"/>
-            <wp:docPr id="1488418337" name="Picture 4"/>
+            <wp:docPr id="1688291388" name="Picture 1"/>
             <wp:cNvGraphicFramePr>
               <a:graphicFrameLocks xmlns:a="http://schemas.openxmlformats.org/drawingml/2006/main" noChangeAspect="1"/>
             </wp:cNvGraphicFramePr>
@@ -6886,7 +6896,7 @@
               <a:graphicData uri="http://schemas.openxmlformats.org/drawingml/2006/picture">
                 <pic:pic xmlns:pic="http://schemas.openxmlformats.org/drawingml/2006/picture">
                   <pic:nvPicPr>
-                    <pic:cNvPr id="1488418337" name="Picture 1488418337"/>
+                    <pic:cNvPr id="1688291388" name=""/>
                     <pic:cNvPicPr/>
                   </pic:nvPicPr>
                   <pic:blipFill>
@@ -6898,7 +6908,7 @@
                   <pic:spPr>
                     <a:xfrm>
                       <a:off x="0" y="0"/>
-                      <a:ext cx="5760720" cy="2731770"/>
+                      <a:ext cx="5760720" cy="2788920"/>
                     </a:xfrm>
                     <a:prstGeom prst="rect">
                       <a:avLst/>
@@ -6907,36 +6917,96 @@
                 </pic:pic>
               </a:graphicData>
             </a:graphic>
+            <wp14:sizeRelV relativeFrom="margin">
+              <wp14:pctHeight>0</wp14:pctHeight>
+            </wp14:sizeRelV>
           </wp:anchor>
         </w:drawing>
       </w:r>
       <w:r>
+        <w:rPr>
+          <w:rFonts w:ascii="Times New Roman" w:hAnsi="Times New Roman"/>
+          <w:sz w:val="24"/>
+        </w:rPr>
+        <w:t>hyperparameter selection.</w:t>
+      </w:r>
+    </w:p>
+    <w:p>
+      <w:pPr>
+        <w:spacing w:after="120" w:line="360" w:lineRule="exact"/>
+      </w:pPr>
+    </w:p>
+    <w:p>
+      <w:r>
+        <w:drawing>
+          <wp:inline distT="0" distB="0" distL="0" distR="0" wp14:anchorId="068D0D9B" wp14:editId="6476FADC">
+            <wp:extent cx="5760000" cy="3177143"/>
+            <wp:effectExtent l="0" t="0" r="0" b="4445"/>
+            <wp:docPr id="1274768701" name="Picture 1"/>
+            <wp:cNvGraphicFramePr>
+              <a:graphicFrameLocks xmlns:a="http://schemas.openxmlformats.org/drawingml/2006/main" noChangeAspect="1"/>
+            </wp:cNvGraphicFramePr>
+            <a:graphic xmlns:a="http://schemas.openxmlformats.org/drawingml/2006/main">
+              <a:graphicData uri="http://schemas.openxmlformats.org/drawingml/2006/picture">
+                <pic:pic xmlns:pic="http://schemas.openxmlformats.org/drawingml/2006/picture">
+                  <pic:nvPicPr>
+                    <pic:cNvPr id="1274768701" name=""/>
+                    <pic:cNvPicPr/>
+                  </pic:nvPicPr>
+                  <pic:blipFill>
+                    <a:blip r:embed="rId8"/>
+                    <a:stretch>
+                      <a:fillRect/>
+                    </a:stretch>
+                  </pic:blipFill>
+                  <pic:spPr>
+                    <a:xfrm>
+                      <a:off x="0" y="0"/>
+                      <a:ext cx="5760000" cy="3177143"/>
+                    </a:xfrm>
+                    <a:prstGeom prst="rect">
+                      <a:avLst/>
+                    </a:prstGeom>
+                  </pic:spPr>
+                </pic:pic>
+              </a:graphicData>
+            </a:graphic>
+          </wp:inline>
+        </w:drawing>
+      </w:r>
+      <w:r>
         <w:br w:type="page"/>
       </w:r>
     </w:p>
     <w:p>
       <w:pPr>
         <w:spacing w:before="240" w:after="120"/>
+      </w:pPr>
+      <w:r>
+        <w:rPr>
+          <w:rFonts w:ascii="Times New Roman" w:hAnsi="Times New Roman"/>
+          <w:b/>
+          <w:sz w:val="36"/>
+          <w:szCs w:val="28"/>
+        </w:rPr>
+        <w:lastRenderedPageBreak/>
+        <w:t>8. Conclusion &amp; Future Work</w:t>
+      </w:r>
+    </w:p>
+    <w:p>
+      <w:pPr>
+        <w:spacing w:before="160" w:after="80"/>
+        <w:rPr>
+          <w:sz w:val="24"/>
+          <w:szCs w:val="24"/>
+        </w:rPr>
       </w:pPr>
       <w:r>
         <w:rPr>
           <w:rFonts w:ascii="Times New Roman" w:hAnsi="Times New Roman"/>
           <w:b/>
           <w:sz w:val="28"/>
-        </w:rPr>
-        <w:lastRenderedPageBreak/>
-        <w:t>8. Conclusion &amp; Future Work</w:t>
-      </w:r>
-    </w:p>
-    <w:p>
-      <w:pPr>
-        <w:spacing w:before="160" w:after="80"/>
-      </w:pPr>
-      <w:r>
-        <w:rPr>
-          <w:rFonts w:ascii="Times New Roman" w:hAnsi="Times New Roman"/>
-          <w:b/>
-          <w:sz w:val="24"/>
+          <w:szCs w:val="24"/>
         </w:rPr>
         <w:t>8.1 Summary of Learning</w:t>
       </w:r>
@@ -6985,14 +7055,17 @@
         <w:tblLook w:val="04A0" w:firstRow="1" w:lastRow="0" w:firstColumn="1" w:lastColumn="0" w:noHBand="0" w:noVBand="1"/>
       </w:tblPr>
       <w:tblGrid>
-        <w:gridCol w:w="3024"/>
-        <w:gridCol w:w="3024"/>
-        <w:gridCol w:w="3024"/>
+        <w:gridCol w:w="3090"/>
+        <w:gridCol w:w="3090"/>
+        <w:gridCol w:w="3090"/>
       </w:tblGrid>
       <w:tr>
+        <w:trPr>
+          <w:trHeight w:val="274"/>
+        </w:trPr>
         <w:tc>
           <w:tcPr>
-            <w:tcW w:w="3024" w:type="dxa"/>
+            <w:tcW w:w="3090" w:type="dxa"/>
           </w:tcPr>
           <w:p>
             <w:r>
@@ -7005,7 +7078,7 @@
         </w:tc>
         <w:tc>
           <w:tcPr>
-            <w:tcW w:w="3024" w:type="dxa"/>
+            <w:tcW w:w="3090" w:type="dxa"/>
           </w:tcPr>
           <w:p>
             <w:r>
@@ -7018,7 +7091,7 @@
         </w:tc>
         <w:tc>
           <w:tcPr>
-            <w:tcW w:w="3024" w:type="dxa"/>
+            <w:tcW w:w="3090" w:type="dxa"/>
           </w:tcPr>
           <w:p>
             <w:r>
@@ -7031,9 +7104,12 @@
         </w:tc>
       </w:tr>
       <w:tr>
+        <w:trPr>
+          <w:trHeight w:val="837"/>
+        </w:trPr>
         <w:tc>
           <w:tcPr>
-            <w:tcW w:w="3024" w:type="dxa"/>
+            <w:tcW w:w="3090" w:type="dxa"/>
           </w:tcPr>
           <w:p>
             <w:r>
@@ -7043,7 +7119,7 @@
         </w:tc>
         <w:tc>
           <w:tcPr>
-            <w:tcW w:w="3024" w:type="dxa"/>
+            <w:tcW w:w="3090" w:type="dxa"/>
           </w:tcPr>
           <w:p>
             <w:r>
@@ -7053,7 +7129,7 @@
         </w:tc>
         <w:tc>
           <w:tcPr>
-            <w:tcW w:w="3024" w:type="dxa"/>
+            <w:tcW w:w="3090" w:type="dxa"/>
           </w:tcPr>
           <w:p>
             <w:r>
@@ -7063,9 +7139,12 @@
         </w:tc>
       </w:tr>
       <w:tr>
+        <w:trPr>
+          <w:trHeight w:val="1112"/>
+        </w:trPr>
         <w:tc>
           <w:tcPr>
-            <w:tcW w:w="3024" w:type="dxa"/>
+            <w:tcW w:w="3090" w:type="dxa"/>
           </w:tcPr>
           <w:p>
             <w:r>
@@ -7075,7 +7154,7 @@
         </w:tc>
         <w:tc>
           <w:tcPr>
-            <w:tcW w:w="3024" w:type="dxa"/>
+            <w:tcW w:w="3090" w:type="dxa"/>
           </w:tcPr>
           <w:p>
             <w:r>
@@ -7085,7 +7164,7 @@
         </w:tc>
         <w:tc>
           <w:tcPr>
-            <w:tcW w:w="3024" w:type="dxa"/>
+            <w:tcW w:w="3090" w:type="dxa"/>
           </w:tcPr>
           <w:p>
             <w:r>
@@ -7095,9 +7174,12 @@
         </w:tc>
       </w:tr>
       <w:tr>
+        <w:trPr>
+          <w:trHeight w:val="1112"/>
+        </w:trPr>
         <w:tc>
           <w:tcPr>
-            <w:tcW w:w="3024" w:type="dxa"/>
+            <w:tcW w:w="3090" w:type="dxa"/>
           </w:tcPr>
           <w:p>
             <w:r>
@@ -7107,7 +7189,7 @@
         </w:tc>
         <w:tc>
           <w:tcPr>
-            <w:tcW w:w="3024" w:type="dxa"/>
+            <w:tcW w:w="3090" w:type="dxa"/>
           </w:tcPr>
           <w:p>
             <w:r>
@@ -7117,7 +7199,7 @@
         </w:tc>
         <w:tc>
           <w:tcPr>
-            <w:tcW w:w="3024" w:type="dxa"/>
+            <w:tcW w:w="3090" w:type="dxa"/>
           </w:tcPr>
           <w:p>
             <w:r>
@@ -7127,9 +7209,12 @@
         </w:tc>
       </w:tr>
       <w:tr>
+        <w:trPr>
+          <w:trHeight w:val="837"/>
+        </w:trPr>
         <w:tc>
           <w:tcPr>
-            <w:tcW w:w="3024" w:type="dxa"/>
+            <w:tcW w:w="3090" w:type="dxa"/>
           </w:tcPr>
           <w:p>
             <w:r>
@@ -7139,7 +7224,7 @@
         </w:tc>
         <w:tc>
           <w:tcPr>
-            <w:tcW w:w="3024" w:type="dxa"/>
+            <w:tcW w:w="3090" w:type="dxa"/>
           </w:tcPr>
           <w:p>
             <w:r>
@@ -7149,7 +7234,7 @@
         </w:tc>
         <w:tc>
           <w:tcPr>
-            <w:tcW w:w="3024" w:type="dxa"/>
+            <w:tcW w:w="3090" w:type="dxa"/>
           </w:tcPr>
           <w:p>
             <w:r>
@@ -7159,9 +7244,12 @@
         </w:tc>
       </w:tr>
       <w:tr>
+        <w:trPr>
+          <w:trHeight w:val="837"/>
+        </w:trPr>
         <w:tc>
           <w:tcPr>
-            <w:tcW w:w="3024" w:type="dxa"/>
+            <w:tcW w:w="3090" w:type="dxa"/>
           </w:tcPr>
           <w:p>
             <w:r>
@@ -7171,7 +7259,7 @@
         </w:tc>
         <w:tc>
           <w:tcPr>
-            <w:tcW w:w="3024" w:type="dxa"/>
+            <w:tcW w:w="3090" w:type="dxa"/>
           </w:tcPr>
           <w:p>
             <w:r>
@@ -7181,7 +7269,7 @@
         </w:tc>
         <w:tc>
           <w:tcPr>
-            <w:tcW w:w="3024" w:type="dxa"/>
+            <w:tcW w:w="3090" w:type="dxa"/>
           </w:tcPr>
           <w:p>
             <w:r>
@@ -7191,9 +7279,12 @@
         </w:tc>
       </w:tr>
       <w:tr>
+        <w:trPr>
+          <w:trHeight w:val="823"/>
+        </w:trPr>
         <w:tc>
           <w:tcPr>
-            <w:tcW w:w="3024" w:type="dxa"/>
+            <w:tcW w:w="3090" w:type="dxa"/>
           </w:tcPr>
           <w:p>
             <w:r>
@@ -7203,7 +7294,7 @@
         </w:tc>
         <w:tc>
           <w:tcPr>
-            <w:tcW w:w="3024" w:type="dxa"/>
+            <w:tcW w:w="3090" w:type="dxa"/>
           </w:tcPr>
           <w:p>
             <w:r>
@@ -7213,7 +7304,7 @@
         </w:tc>
         <w:tc>
           <w:tcPr>
-            <w:tcW w:w="3024" w:type="dxa"/>
+            <w:tcW w:w="3090" w:type="dxa"/>
           </w:tcPr>
           <w:p>
             <w:r>
@@ -7223,19 +7314,23 @@
         </w:tc>
       </w:tr>
       <w:tr>
+        <w:trPr>
+          <w:trHeight w:val="837"/>
+        </w:trPr>
         <w:tc>
           <w:tcPr>
-            <w:tcW w:w="3024" w:type="dxa"/>
+            <w:tcW w:w="3090" w:type="dxa"/>
           </w:tcPr>
           <w:p>
             <w:r>
+              <w:lastRenderedPageBreak/>
               <w:t>Report Writing &amp; Presentation</w:t>
             </w:r>
           </w:p>
         </w:tc>
         <w:tc>
           <w:tcPr>
-            <w:tcW w:w="3024" w:type="dxa"/>
+            <w:tcW w:w="3090" w:type="dxa"/>
           </w:tcPr>
           <w:p>
             <w:r>
@@ -7245,7 +7340,7 @@
         </w:tc>
         <w:tc>
           <w:tcPr>
-            <w:tcW w:w="3024" w:type="dxa"/>
+            <w:tcW w:w="3090" w:type="dxa"/>
           </w:tcPr>
           <w:p>
             <w:r>
@@ -7255,9 +7350,12 @@
         </w:tc>
       </w:tr>
       <w:tr>
+        <w:trPr>
+          <w:trHeight w:val="274"/>
+        </w:trPr>
         <w:tc>
           <w:tcPr>
-            <w:tcW w:w="3024" w:type="dxa"/>
+            <w:tcW w:w="3090" w:type="dxa"/>
           </w:tcPr>
           <w:p>
             <w:r>
@@ -7267,7 +7365,7 @@
         </w:tc>
         <w:tc>
           <w:tcPr>
-            <w:tcW w:w="3024" w:type="dxa"/>
+            <w:tcW w:w="3090" w:type="dxa"/>
           </w:tcPr>
           <w:p>
             <w:r>
@@ -7277,7 +7375,7 @@
         </w:tc>
         <w:tc>
           <w:tcPr>
-            <w:tcW w:w="3024" w:type="dxa"/>
+            <w:tcW w:w="3090" w:type="dxa"/>
           </w:tcPr>
           <w:p>
             <w:r>
@@ -7291,12 +7389,17 @@
     <w:p>
       <w:pPr>
         <w:spacing w:before="160" w:after="80"/>
+        <w:rPr>
+          <w:sz w:val="24"/>
+          <w:szCs w:val="24"/>
+        </w:rPr>
       </w:pPr>
       <w:r>
         <w:rPr>
           <w:rFonts w:ascii="Times New Roman" w:hAnsi="Times New Roman"/>
           <w:b/>
-          <w:sz w:val="24"/>
+          <w:sz w:val="28"/>
+          <w:szCs w:val="24"/>
         </w:rPr>
         <w:t>8.3 Limitations of the Current Approach</w:t>
       </w:r>
@@ -7304,8 +7407,11 @@
     <w:p>
       <w:pPr>
         <w:pStyle w:val="ListBullet"/>
+        <w:numPr>
+          <w:ilvl w:val="0"/>
+          <w:numId w:val="24"/>
+        </w:numPr>
         <w:spacing w:after="80"/>
-        <w:ind w:left="576"/>
       </w:pPr>
       <w:r>
         <w:rPr>
@@ -7318,8 +7424,11 @@
     <w:p>
       <w:pPr>
         <w:pStyle w:val="ListBullet"/>
+        <w:numPr>
+          <w:ilvl w:val="0"/>
+          <w:numId w:val="24"/>
+        </w:numPr>
         <w:spacing w:after="80"/>
-        <w:ind w:left="576"/>
       </w:pPr>
       <w:r>
         <w:rPr>
@@ -7332,8 +7441,11 @@
     <w:p>
       <w:pPr>
         <w:pStyle w:val="ListBullet"/>
+        <w:numPr>
+          <w:ilvl w:val="0"/>
+          <w:numId w:val="24"/>
+        </w:numPr>
         <w:spacing w:after="80"/>
-        <w:ind w:left="576"/>
       </w:pPr>
       <w:r>
         <w:rPr>
@@ -7346,8 +7458,11 @@
     <w:p>
       <w:pPr>
         <w:pStyle w:val="ListBullet"/>
+        <w:numPr>
+          <w:ilvl w:val="0"/>
+          <w:numId w:val="24"/>
+        </w:numPr>
         <w:spacing w:after="80"/>
-        <w:ind w:left="576"/>
       </w:pPr>
       <w:r>
         <w:rPr>
@@ -7360,12 +7475,17 @@
     <w:p>
       <w:pPr>
         <w:spacing w:before="160" w:after="80"/>
+        <w:rPr>
+          <w:sz w:val="24"/>
+          <w:szCs w:val="24"/>
+        </w:rPr>
       </w:pPr>
       <w:r>
         <w:rPr>
           <w:rFonts w:ascii="Times New Roman" w:hAnsi="Times New Roman"/>
           <w:b/>
-          <w:sz w:val="24"/>
+          <w:sz w:val="28"/>
+          <w:szCs w:val="24"/>
         </w:rPr>
         <w:t>8.4 Future Scope</w:t>
       </w:r>
@@ -7373,8 +7493,11 @@
     <w:p>
       <w:pPr>
         <w:pStyle w:val="ListBullet"/>
+        <w:numPr>
+          <w:ilvl w:val="0"/>
+          <w:numId w:val="25"/>
+        </w:numPr>
         <w:spacing w:after="80"/>
-        <w:ind w:left="576"/>
       </w:pPr>
       <w:r>
         <w:rPr>
@@ -7387,8 +7510,11 @@
     <w:p>
       <w:pPr>
         <w:pStyle w:val="ListBullet"/>
+        <w:numPr>
+          <w:ilvl w:val="0"/>
+          <w:numId w:val="25"/>
+        </w:numPr>
         <w:spacing w:after="80"/>
-        <w:ind w:left="576"/>
       </w:pPr>
       <w:r>
         <w:rPr>
@@ -7401,8 +7527,11 @@
     <w:p>
       <w:pPr>
         <w:pStyle w:val="ListBullet"/>
+        <w:numPr>
+          <w:ilvl w:val="0"/>
+          <w:numId w:val="25"/>
+        </w:numPr>
         <w:spacing w:after="80"/>
-        <w:ind w:left="576"/>
       </w:pPr>
       <w:r>
         <w:rPr>
@@ -7415,8 +7544,11 @@
     <w:p>
       <w:pPr>
         <w:pStyle w:val="ListBullet"/>
+        <w:numPr>
+          <w:ilvl w:val="0"/>
+          <w:numId w:val="25"/>
+        </w:numPr>
         <w:spacing w:after="80"/>
-        <w:ind w:left="576"/>
       </w:pPr>
       <w:r>
         <w:rPr>
@@ -7429,8 +7561,11 @@
     <w:p>
       <w:pPr>
         <w:pStyle w:val="ListBullet"/>
+        <w:numPr>
+          <w:ilvl w:val="0"/>
+          <w:numId w:val="25"/>
+        </w:numPr>
         <w:spacing w:after="80"/>
-        <w:ind w:left="576"/>
       </w:pPr>
       <w:r>
         <w:rPr>
@@ -7883,26 +8018,31 @@
       <w:r>
         <w:rPr>
           <w:rFonts w:ascii="Times New Roman" w:hAnsi="Times New Roman"/>
-          <w:sz w:val="24"/>
-        </w:rPr>
-        <w:t xml:space="preserve">final </w:t>
-      </w:r>
-      <w:proofErr w:type="gramStart"/>
-      <w:r>
-        <w:rPr>
-          <w:rFonts w:ascii="Times New Roman" w:hAnsi="Times New Roman"/>
-          <w:sz w:val="24"/>
-        </w:rPr>
-        <w:t>project.ipynb</w:t>
-      </w:r>
-      <w:proofErr w:type="gramEnd"/>
-      <w:r>
-        <w:rPr>
-          <w:rFonts w:ascii="Times New Roman" w:hAnsi="Times New Roman"/>
-          <w:sz w:val="24"/>
-        </w:rPr>
-        <w:t xml:space="preserve"> — Main Jupyter notebook containing all three modules: benchmark_compare (Cell 1), plotting_engine (Cell 3), performance_forecaster (Cell 5).</w:t>
-      </w:r>
+          <w:b/>
+          <w:bCs/>
+          <w:sz w:val="24"/>
+        </w:rPr>
+        <w:t>GitHub Repository:</w:t>
+      </w:r>
+      <w:r>
+        <w:rPr>
+          <w:rFonts w:ascii="Times New Roman" w:hAnsi="Times New Roman"/>
+          <w:b/>
+          <w:bCs/>
+          <w:sz w:val="24"/>
+        </w:rPr>
+        <w:t xml:space="preserve"> </w:t>
+      </w:r>
+      <w:hyperlink r:id="rId9" w:history="1">
+        <w:r>
+          <w:rPr>
+            <w:rStyle w:val="Hyperlink"/>
+            <w:rFonts w:ascii="Times New Roman" w:hAnsi="Times New Roman"/>
+            <w:sz w:val="24"/>
+          </w:rPr>
+          <w:t>https://github.com/raghupatharlapalli011/Autolingo.git</w:t>
+        </w:r>
+      </w:hyperlink>
     </w:p>
     <w:p>
       <w:pPr>
@@ -7912,31 +8052,54 @@
           <w:numId w:val="13"/>
         </w:numPr>
         <w:spacing w:after="80"/>
-      </w:pPr>
-      <w:r>
-        <w:rPr>
-          <w:rFonts w:ascii="Times New Roman" w:hAnsi="Times New Roman"/>
-          <w:sz w:val="24"/>
-        </w:rPr>
-        <w:t>dashboard.py — Full Streamlit web application with four pages: Live Autocomplete, Benchmark Results, Performance Forecaster, and How It Works.</w:t>
-      </w:r>
-    </w:p>
-    <w:p>
-      <w:pPr>
-        <w:pStyle w:val="ListBullet"/>
-        <w:numPr>
-          <w:ilvl w:val="0"/>
-          <w:numId w:val="13"/>
-        </w:numPr>
-        <w:spacing w:after="80"/>
-      </w:pPr>
-      <w:r>
-        <w:rPr>
-          <w:rFonts w:ascii="Times New Roman" w:hAnsi="Times New Roman"/>
-          <w:sz w:val="24"/>
-        </w:rPr>
-        <w:t>run_logs.csv — Hyperparameter experiment log with 6 training run records.</w:t>
-      </w:r>
+        <w:rPr>
+          <w:b/>
+          <w:bCs/>
+        </w:rPr>
+      </w:pPr>
+      <w:r>
+        <w:rPr>
+          <w:b/>
+          <w:bCs/>
+        </w:rPr>
+        <w:t xml:space="preserve">Google </w:t>
+      </w:r>
+      <w:proofErr w:type="spellStart"/>
+      <w:r>
+        <w:rPr>
+          <w:b/>
+          <w:bCs/>
+        </w:rPr>
+        <w:t>Colab</w:t>
+      </w:r>
+      <w:proofErr w:type="spellEnd"/>
+      <w:r>
+        <w:rPr>
+          <w:b/>
+          <w:bCs/>
+        </w:rPr>
+        <w:t xml:space="preserve"> Notebook</w:t>
+      </w:r>
+      <w:r>
+        <w:rPr>
+          <w:b/>
+          <w:bCs/>
+        </w:rPr>
+        <w:t>:</w:t>
+      </w:r>
+      <w:r>
+        <w:t xml:space="preserve"> </w:t>
+      </w:r>
+      <w:proofErr w:type="spellStart"/>
+      <w:r>
+        <w:t>Autolingo_</w:t>
+      </w:r>
+      <w:proofErr w:type="gramStart"/>
+      <w:r>
+        <w:t>project.ipynb</w:t>
+      </w:r>
+      <w:proofErr w:type="spellEnd"/>
+      <w:proofErr w:type="gramEnd"/>
     </w:p>
     <w:p>
       <w:pPr>
@@ -8341,7 +8504,6 @@
           <w:rFonts w:ascii="Times New Roman" w:hAnsi="Times New Roman"/>
           <w:sz w:val="24"/>
         </w:rPr>
-        <w:lastRenderedPageBreak/>
         <w:t>The dashboard will automatically train all three ML models on the sibling_b.csv data during the first load (this takes approximately 5-10 seconds). Subsequent interactions are instantaneous due to caching.</w:t>
       </w:r>
     </w:p>
@@ -8408,7 +8570,7 @@
                     <pic:cNvPicPr/>
                   </pic:nvPicPr>
                   <pic:blipFill>
-                    <a:blip r:embed="rId8"/>
+                    <a:blip r:embed="rId10"/>
                     <a:stretch>
                       <a:fillRect/>
                     </a:stretch>
@@ -8513,6 +8675,12 @@
     <w:sectPr>
       <w:pgSz w:w="12240" w:h="15840"/>
       <w:pgMar w:top="1440" w:right="1440" w:bottom="1440" w:left="1728" w:header="720" w:footer="720" w:gutter="0"/>
+      <w:pgBorders w:offsetFrom="page">
+        <w:top w:val="single" w:sz="4" w:space="24" w:color="auto"/>
+        <w:left w:val="single" w:sz="4" w:space="24" w:color="auto"/>
+        <w:bottom w:val="single" w:sz="4" w:space="24" w:color="auto"/>
+        <w:right w:val="single" w:sz="4" w:space="24" w:color="auto"/>
+      </w:pgBorders>
       <w:cols w:space="720"/>
       <w:docGrid w:linePitch="360"/>
     </w:sectPr>
@@ -9824,6 +9992,119 @@
     </w:lvl>
   </w:abstractNum>
   <w:abstractNum w:abstractNumId="19" w15:restartNumberingAfterBreak="0">
+    <w:nsid w:val="5D7B044F"/>
+    <w:multiLevelType w:val="hybridMultilevel"/>
+    <w:tmpl w:val="F4E47DC4"/>
+    <w:lvl w:ilvl="0" w:tplc="40090001">
+      <w:start w:val="1"/>
+      <w:numFmt w:val="bullet"/>
+      <w:lvlText w:val=""/>
+      <w:lvlJc w:val="left"/>
+      <w:pPr>
+        <w:ind w:left="936" w:hanging="360"/>
+      </w:pPr>
+      <w:rPr>
+        <w:rFonts w:ascii="Symbol" w:hAnsi="Symbol" w:hint="default"/>
+      </w:rPr>
+    </w:lvl>
+    <w:lvl w:ilvl="1" w:tplc="40090003" w:tentative="1">
+      <w:start w:val="1"/>
+      <w:numFmt w:val="bullet"/>
+      <w:lvlText w:val="o"/>
+      <w:lvlJc w:val="left"/>
+      <w:pPr>
+        <w:ind w:left="1656" w:hanging="360"/>
+      </w:pPr>
+      <w:rPr>
+        <w:rFonts w:ascii="Courier New" w:hAnsi="Courier New" w:cs="Courier New" w:hint="default"/>
+      </w:rPr>
+    </w:lvl>
+    <w:lvl w:ilvl="2" w:tplc="40090005" w:tentative="1">
+      <w:start w:val="1"/>
+      <w:numFmt w:val="bullet"/>
+      <w:lvlText w:val=""/>
+      <w:lvlJc w:val="left"/>
+      <w:pPr>
+        <w:ind w:left="2376" w:hanging="360"/>
+      </w:pPr>
+      <w:rPr>
+        <w:rFonts w:ascii="Wingdings" w:hAnsi="Wingdings" w:hint="default"/>
+      </w:rPr>
+    </w:lvl>
+    <w:lvl w:ilvl="3" w:tplc="40090001" w:tentative="1">
+      <w:start w:val="1"/>
+      <w:numFmt w:val="bullet"/>
+      <w:lvlText w:val=""/>
+      <w:lvlJc w:val="left"/>
+      <w:pPr>
+        <w:ind w:left="3096" w:hanging="360"/>
+      </w:pPr>
+      <w:rPr>
+        <w:rFonts w:ascii="Symbol" w:hAnsi="Symbol" w:hint="default"/>
+      </w:rPr>
+    </w:lvl>
+    <w:lvl w:ilvl="4" w:tplc="40090003" w:tentative="1">
+      <w:start w:val="1"/>
+      <w:numFmt w:val="bullet"/>
+      <w:lvlText w:val="o"/>
+      <w:lvlJc w:val="left"/>
+      <w:pPr>
+        <w:ind w:left="3816" w:hanging="360"/>
+      </w:pPr>
+      <w:rPr>
+        <w:rFonts w:ascii="Courier New" w:hAnsi="Courier New" w:cs="Courier New" w:hint="default"/>
+      </w:rPr>
+    </w:lvl>
+    <w:lvl w:ilvl="5" w:tplc="40090005" w:tentative="1">
+      <w:start w:val="1"/>
+      <w:numFmt w:val="bullet"/>
+      <w:lvlText w:val=""/>
+      <w:lvlJc w:val="left"/>
+      <w:pPr>
+        <w:ind w:left="4536" w:hanging="360"/>
+      </w:pPr>
+      <w:rPr>
+        <w:rFonts w:ascii="Wingdings" w:hAnsi="Wingdings" w:hint="default"/>
+      </w:rPr>
+    </w:lvl>
+    <w:lvl w:ilvl="6" w:tplc="40090001" w:tentative="1">
+      <w:start w:val="1"/>
+      <w:numFmt w:val="bullet"/>
+      <w:lvlText w:val=""/>
+      <w:lvlJc w:val="left"/>
+      <w:pPr>
+        <w:ind w:left="5256" w:hanging="360"/>
+      </w:pPr>
+      <w:rPr>
+        <w:rFonts w:ascii="Symbol" w:hAnsi="Symbol" w:hint="default"/>
+      </w:rPr>
+    </w:lvl>
+    <w:lvl w:ilvl="7" w:tplc="40090003" w:tentative="1">
+      <w:start w:val="1"/>
+      <w:numFmt w:val="bullet"/>
+      <w:lvlText w:val="o"/>
+      <w:lvlJc w:val="left"/>
+      <w:pPr>
+        <w:ind w:left="5976" w:hanging="360"/>
+      </w:pPr>
+      <w:rPr>
+        <w:rFonts w:ascii="Courier New" w:hAnsi="Courier New" w:cs="Courier New" w:hint="default"/>
+      </w:rPr>
+    </w:lvl>
+    <w:lvl w:ilvl="8" w:tplc="40090005" w:tentative="1">
+      <w:start w:val="1"/>
+      <w:numFmt w:val="bullet"/>
+      <w:lvlText w:val=""/>
+      <w:lvlJc w:val="left"/>
+      <w:pPr>
+        <w:ind w:left="6696" w:hanging="360"/>
+      </w:pPr>
+      <w:rPr>
+        <w:rFonts w:ascii="Wingdings" w:hAnsi="Wingdings" w:hint="default"/>
+      </w:rPr>
+    </w:lvl>
+  </w:abstractNum>
+  <w:abstractNum w:abstractNumId="20" w15:restartNumberingAfterBreak="0">
     <w:nsid w:val="5F8C4E28"/>
     <w:multiLevelType w:val="hybridMultilevel"/>
     <w:tmpl w:val="1B423CFE"/>
@@ -9936,7 +10217,7 @@
       </w:rPr>
     </w:lvl>
   </w:abstractNum>
-  <w:abstractNum w:abstractNumId="20" w15:restartNumberingAfterBreak="0">
+  <w:abstractNum w:abstractNumId="21" w15:restartNumberingAfterBreak="0">
     <w:nsid w:val="61164299"/>
     <w:multiLevelType w:val="hybridMultilevel"/>
     <w:tmpl w:val="52B0873A"/>
@@ -10049,7 +10330,7 @@
       </w:rPr>
     </w:lvl>
   </w:abstractNum>
-  <w:abstractNum w:abstractNumId="21" w15:restartNumberingAfterBreak="0">
+  <w:abstractNum w:abstractNumId="22" w15:restartNumberingAfterBreak="0">
     <w:nsid w:val="6A8D7ADA"/>
     <w:multiLevelType w:val="hybridMultilevel"/>
     <w:tmpl w:val="AF201398"/>
@@ -10162,7 +10443,120 @@
       </w:rPr>
     </w:lvl>
   </w:abstractNum>
-  <w:abstractNum w:abstractNumId="22" w15:restartNumberingAfterBreak="0">
+  <w:abstractNum w:abstractNumId="23" w15:restartNumberingAfterBreak="0">
+    <w:nsid w:val="71080C3F"/>
+    <w:multiLevelType w:val="hybridMultilevel"/>
+    <w:tmpl w:val="F168A596"/>
+    <w:lvl w:ilvl="0" w:tplc="40090001">
+      <w:start w:val="1"/>
+      <w:numFmt w:val="bullet"/>
+      <w:lvlText w:val=""/>
+      <w:lvlJc w:val="left"/>
+      <w:pPr>
+        <w:ind w:left="936" w:hanging="360"/>
+      </w:pPr>
+      <w:rPr>
+        <w:rFonts w:ascii="Symbol" w:hAnsi="Symbol" w:hint="default"/>
+      </w:rPr>
+    </w:lvl>
+    <w:lvl w:ilvl="1" w:tplc="40090003" w:tentative="1">
+      <w:start w:val="1"/>
+      <w:numFmt w:val="bullet"/>
+      <w:lvlText w:val="o"/>
+      <w:lvlJc w:val="left"/>
+      <w:pPr>
+        <w:ind w:left="1656" w:hanging="360"/>
+      </w:pPr>
+      <w:rPr>
+        <w:rFonts w:ascii="Courier New" w:hAnsi="Courier New" w:cs="Courier New" w:hint="default"/>
+      </w:rPr>
+    </w:lvl>
+    <w:lvl w:ilvl="2" w:tplc="40090005" w:tentative="1">
+      <w:start w:val="1"/>
+      <w:numFmt w:val="bullet"/>
+      <w:lvlText w:val=""/>
+      <w:lvlJc w:val="left"/>
+      <w:pPr>
+        <w:ind w:left="2376" w:hanging="360"/>
+      </w:pPr>
+      <w:rPr>
+        <w:rFonts w:ascii="Wingdings" w:hAnsi="Wingdings" w:hint="default"/>
+      </w:rPr>
+    </w:lvl>
+    <w:lvl w:ilvl="3" w:tplc="40090001" w:tentative="1">
+      <w:start w:val="1"/>
+      <w:numFmt w:val="bullet"/>
+      <w:lvlText w:val=""/>
+      <w:lvlJc w:val="left"/>
+      <w:pPr>
+        <w:ind w:left="3096" w:hanging="360"/>
+      </w:pPr>
+      <w:rPr>
+        <w:rFonts w:ascii="Symbol" w:hAnsi="Symbol" w:hint="default"/>
+      </w:rPr>
+    </w:lvl>
+    <w:lvl w:ilvl="4" w:tplc="40090003" w:tentative="1">
+      <w:start w:val="1"/>
+      <w:numFmt w:val="bullet"/>
+      <w:lvlText w:val="o"/>
+      <w:lvlJc w:val="left"/>
+      <w:pPr>
+        <w:ind w:left="3816" w:hanging="360"/>
+      </w:pPr>
+      <w:rPr>
+        <w:rFonts w:ascii="Courier New" w:hAnsi="Courier New" w:cs="Courier New" w:hint="default"/>
+      </w:rPr>
+    </w:lvl>
+    <w:lvl w:ilvl="5" w:tplc="40090005" w:tentative="1">
+      <w:start w:val="1"/>
+      <w:numFmt w:val="bullet"/>
+      <w:lvlText w:val=""/>
+      <w:lvlJc w:val="left"/>
+      <w:pPr>
+        <w:ind w:left="4536" w:hanging="360"/>
+      </w:pPr>
+      <w:rPr>
+        <w:rFonts w:ascii="Wingdings" w:hAnsi="Wingdings" w:hint="default"/>
+      </w:rPr>
+    </w:lvl>
+    <w:lvl w:ilvl="6" w:tplc="40090001" w:tentative="1">
+      <w:start w:val="1"/>
+      <w:numFmt w:val="bullet"/>
+      <w:lvlText w:val=""/>
+      <w:lvlJc w:val="left"/>
+      <w:pPr>
+        <w:ind w:left="5256" w:hanging="360"/>
+      </w:pPr>
+      <w:rPr>
+        <w:rFonts w:ascii="Symbol" w:hAnsi="Symbol" w:hint="default"/>
+      </w:rPr>
+    </w:lvl>
+    <w:lvl w:ilvl="7" w:tplc="40090003" w:tentative="1">
+      <w:start w:val="1"/>
+      <w:numFmt w:val="bullet"/>
+      <w:lvlText w:val="o"/>
+      <w:lvlJc w:val="left"/>
+      <w:pPr>
+        <w:ind w:left="5976" w:hanging="360"/>
+      </w:pPr>
+      <w:rPr>
+        <w:rFonts w:ascii="Courier New" w:hAnsi="Courier New" w:cs="Courier New" w:hint="default"/>
+      </w:rPr>
+    </w:lvl>
+    <w:lvl w:ilvl="8" w:tplc="40090005" w:tentative="1">
+      <w:start w:val="1"/>
+      <w:numFmt w:val="bullet"/>
+      <w:lvlText w:val=""/>
+      <w:lvlJc w:val="left"/>
+      <w:pPr>
+        <w:ind w:left="6696" w:hanging="360"/>
+      </w:pPr>
+      <w:rPr>
+        <w:rFonts w:ascii="Wingdings" w:hAnsi="Wingdings" w:hint="default"/>
+      </w:rPr>
+    </w:lvl>
+  </w:abstractNum>
+  <w:abstractNum w:abstractNumId="24" w15:restartNumberingAfterBreak="0">
     <w:nsid w:val="74F10F93"/>
     <w:multiLevelType w:val="hybridMultilevel"/>
     <w:tmpl w:val="73C4A60A"/>
@@ -10303,13 +10697,13 @@
     <w:abstractNumId w:val="0"/>
   </w:num>
   <w:num w:numId="10" w16cid:durableId="1355496931">
-    <w:abstractNumId w:val="22"/>
+    <w:abstractNumId w:val="24"/>
   </w:num>
   <w:num w:numId="11" w16cid:durableId="409888653">
     <w:abstractNumId w:val="16"/>
   </w:num>
   <w:num w:numId="12" w16cid:durableId="1182663658">
-    <w:abstractNumId w:val="19"/>
+    <w:abstractNumId w:val="20"/>
   </w:num>
   <w:num w:numId="13" w16cid:durableId="1307082247">
     <w:abstractNumId w:val="14"/>
@@ -10324,7 +10718,7 @@
     <w:abstractNumId w:val="12"/>
   </w:num>
   <w:num w:numId="17" w16cid:durableId="877543443">
-    <w:abstractNumId w:val="21"/>
+    <w:abstractNumId w:val="22"/>
   </w:num>
   <w:num w:numId="18" w16cid:durableId="410008014">
     <w:abstractNumId w:val="18"/>
@@ -10333,7 +10727,7 @@
     <w:abstractNumId w:val="10"/>
   </w:num>
   <w:num w:numId="20" w16cid:durableId="260459550">
-    <w:abstractNumId w:val="20"/>
+    <w:abstractNumId w:val="21"/>
   </w:num>
   <w:num w:numId="21" w16cid:durableId="1202860496">
     <w:abstractNumId w:val="13"/>
@@ -10343,6 +10737,12 @@
   </w:num>
   <w:num w:numId="23" w16cid:durableId="641886825">
     <w:abstractNumId w:val="9"/>
+  </w:num>
+  <w:num w:numId="24" w16cid:durableId="1844739215">
+    <w:abstractNumId w:val="19"/>
+  </w:num>
+  <w:num w:numId="25" w16cid:durableId="1462267480">
+    <w:abstractNumId w:val="23"/>
   </w:num>
 </w:numbering>
 </file>
@@ -10950,6 +11350,7 @@
   <w:style w:type="character" w:default="1" w:styleId="DefaultParagraphFont">
     <w:name w:val="Default Paragraph Font"/>
     <w:uiPriority w:val="1"/>
+    <w:semiHidden/>
     <w:unhideWhenUsed/>
   </w:style>
   <w:style w:type="table" w:default="1" w:styleId="TableNormal">
@@ -21726,6 +22127,29 @@
       </w:tcPr>
     </w:tblStylePr>
   </w:style>
+  <w:style w:type="character" w:styleId="Hyperlink">
+    <w:name w:val="Hyperlink"/>
+    <w:basedOn w:val="DefaultParagraphFont"/>
+    <w:uiPriority w:val="99"/>
+    <w:unhideWhenUsed/>
+    <w:rsid w:val="002C4679"/>
+    <w:rPr>
+      <w:color w:val="0000FF" w:themeColor="hyperlink"/>
+      <w:u w:val="single"/>
+    </w:rPr>
+  </w:style>
+  <w:style w:type="character" w:styleId="UnresolvedMention">
+    <w:name w:val="Unresolved Mention"/>
+    <w:basedOn w:val="DefaultParagraphFont"/>
+    <w:uiPriority w:val="99"/>
+    <w:semiHidden/>
+    <w:unhideWhenUsed/>
+    <w:rsid w:val="002C4679"/>
+    <w:rPr>
+      <w:color w:val="605E5C"/>
+      <w:shd w:val="clear" w:color="auto" w:fill="E1DFDD"/>
+    </w:rPr>
+  </w:style>
 </w:styles>
 </file>
 

</xml_diff>